<commit_message>
Refine caveats and terminology
</commit_message>
<xml_diff>
--- a/docs/01_选题评估与研究设计.docx
+++ b/docs/01_选题评估与研究设计.docx
@@ -92,6 +92,11 @@
     <w:p>
       <w:r>
         <w:t>在这个框架下，“农牧结合”不是结论本身，而是资源组织中的一类现象；真正需要解释的是这些资源如何在山地景观中被安排和连接。</w:t>
+      </w:r>
+    </w:p>
+    <w:p>
+      <w:r>
+        <w:t>为行文简洁，正文中可在首次说明后将“跨生态带资源组织”简称为“生态带资源整合”或“资源组织”，但题目和核心问题仍保留完整表述，以避免概念过窄。</w:t>
       </w:r>
     </w:p>
     <w:p>

</xml_diff>